<commit_message>
Note de présentation mise à jour (accueil, favoris, partage, 30 jours, hors connexion)
Co-Authored-By: Claude Fable 5.1 <noreply@anthropic.com>
Claude-Session: https://claude.ai/code/session_017Kbm7EwQptZrFZ4WUSTth2
</commit_message>
<xml_diff>
--- a/docs/Annubus_presentation.docx
+++ b/docs/Annubus_presentation.docx
@@ -128,7 +128,7 @@
                 <w:sz w:val="20"/>
                 <w:szCs w:val="20"/>
               </w:rPr>
-              <w:t xml:space="preserve">Note de présentation · octobre 2026 · Julien Aron</w:t>
+              <w:t xml:space="preserve">Note de présentation · version du 24 octobre 2026 · Julien Aron</w:t>
             </w:r>
           </w:p>
         </w:tc>
@@ -156,7 +156,7 @@
         <w:t xml:space="preserve">En bref. </w:t>
       </w:r>
       <w:r>
-        <w:t xml:space="preserve">Une application web, utilisable sur téléphone comme sur ordinateur, qui regroupe les 201 contacts partenaires de l'équipe (CMP, CSAPA, hébergement, LHSS, urgences, médecins…), déjà repris et vérifiés. On y trouve un numéro en quelques secondes, on appelle d'un clic, et toute l'équipe peut la tenir à jour. Elle est réservée aux membres de l'équipe et ne coûte rien.</w:t>
+        <w:t xml:space="preserve">Une application web, utilisable sur téléphone comme sur ordinateur, qui regroupe les 201 contacts partenaires de l'équipe (CMP, CSAPA, hébergement, LHSS, urgences, médecins…), déjà repris et vérifiés. On y trouve un numéro en quelques secondes, on appelle d'un clic, chacun garde ses favoris et ses derniers appels sous la main, et toute l'équipe peut la tenir à jour. Elle est réservée aux membres de l'équipe, reste consultable sans réseau et ne coûte rien.</w:t>
       </w:r>
     </w:p>
     <w:p>
@@ -169,7 +169,7 @@
     </w:p>
     <w:p>
       <w:pPr>
-        <w:spacing w:after="100" w:line="276"/>
+        <w:spacing w:after="80" w:line="264"/>
       </w:pPr>
       <w:r>
         <w:t xml:space="preserve">Trois difficultés font perdre du temps à l'équipe et, parfois, une orientation :</w:t>
@@ -182,7 +182,7 @@
           <w:ilvl w:val="0"/>
           <w:numId w:val="2"/>
         </w:numPr>
-        <w:spacing w:after="60" w:line="264"/>
+        <w:spacing w:after="40" w:line="258"/>
       </w:pPr>
       <w:r>
         <w:rPr>
@@ -202,7 +202,7 @@
           <w:ilvl w:val="0"/>
           <w:numId w:val="2"/>
         </w:numPr>
-        <w:spacing w:after="60" w:line="264"/>
+        <w:spacing w:after="40" w:line="258"/>
       </w:pPr>
       <w:r>
         <w:rPr>
@@ -222,7 +222,7 @@
           <w:ilvl w:val="0"/>
           <w:numId w:val="2"/>
         </w:numPr>
-        <w:spacing w:after="60" w:line="264"/>
+        <w:spacing w:after="40" w:line="258"/>
       </w:pPr>
       <w:r>
         <w:rPr>
@@ -289,8 +289,8 @@
                 <w:b/>
                 <w:bCs/>
                 <w:color w:val="FFFFFF"/>
-                <w:sz w:val="19"/>
-                <w:szCs w:val="19"/>
+                <w:sz w:val="18"/>
+                <w:szCs w:val="18"/>
               </w:rPr>
               <w:t xml:space="preserve">Fonction</w:t>
             </w:r>
@@ -322,8 +322,8 @@
                 <w:b/>
                 <w:bCs/>
                 <w:color w:val="FFFFFF"/>
-                <w:sz w:val="19"/>
-                <w:szCs w:val="19"/>
+                <w:sz w:val="18"/>
+                <w:szCs w:val="18"/>
               </w:rPr>
               <w:t xml:space="preserve">Concrètement</w:t>
             </w:r>
@@ -359,10 +359,10 @@
                 <w:b w:val="false"/>
                 <w:bCs w:val="false"/>
                 <w:color w:val="15203A"/>
-                <w:sz w:val="19"/>
-                <w:szCs w:val="19"/>
-              </w:rPr>
-              <w:t xml:space="preserve">Recherche instantanée</w:t>
+                <w:sz w:val="18"/>
+                <w:szCs w:val="18"/>
+              </w:rPr>
+              <w:t xml:space="preserve">Accueil personnel</w:t>
             </w:r>
           </w:p>
         </w:tc>
@@ -391,10 +391,10 @@
                 <w:b w:val="false"/>
                 <w:bCs w:val="false"/>
                 <w:color w:val="15203A"/>
-                <w:sz w:val="19"/>
-                <w:szCs w:val="19"/>
-              </w:rPr>
-              <w:t xml:space="preserve">Par nom, ville, catégorie, mot-clé (« TSO », « DDN », « CMP »…) ou par un bout de numéro, sans tenir compte des accents.</w:t>
+                <w:sz w:val="18"/>
+                <w:szCs w:val="18"/>
+              </w:rPr>
+              <w:t xml:space="preserve">La page d'accueil montre les derniers numéros appelés, les favoris de la personne (chacun a les siens) et les catégories sous forme de grandes tuiles avec le nombre de fiches.</w:t>
             </w:r>
           </w:p>
         </w:tc>
@@ -429,10 +429,10 @@
                 <w:b w:val="false"/>
                 <w:bCs w:val="false"/>
                 <w:color w:val="15203A"/>
-                <w:sz w:val="19"/>
-                <w:szCs w:val="19"/>
-              </w:rPr>
-              <w:t xml:space="preserve">Appel en un clic</w:t>
+                <w:sz w:val="18"/>
+                <w:szCs w:val="18"/>
+              </w:rPr>
+              <w:t xml:space="preserve">Recherche instantanée</w:t>
             </w:r>
           </w:p>
         </w:tc>
@@ -462,10 +462,10 @@
                 <w:b w:val="false"/>
                 <w:bCs w:val="false"/>
                 <w:color w:val="15203A"/>
-                <w:sz w:val="19"/>
-                <w:szCs w:val="19"/>
-              </w:rPr>
-              <w:t xml:space="preserve">Toucher un numéro lance l'appel depuis le téléphone. Une icône permet aussi de le copier.</w:t>
+                <w:sz w:val="18"/>
+                <w:szCs w:val="18"/>
+              </w:rPr>
+              <w:t xml:space="preserve">Par nom, ville, catégorie, mot-clé (« TSO », « DDN », « CMP »…) ou par un bout de numéro, sans tenir compte des accents. Les fiches dont le nom contient le mot cherché s'affichent en premier.</w:t>
             </w:r>
           </w:p>
         </w:tc>
@@ -499,10 +499,10 @@
                 <w:b w:val="false"/>
                 <w:bCs w:val="false"/>
                 <w:color w:val="15203A"/>
-                <w:sz w:val="19"/>
-                <w:szCs w:val="19"/>
-              </w:rPr>
-              <w:t xml:space="preserve">Fiches claires</w:t>
+                <w:sz w:val="18"/>
+                <w:szCs w:val="18"/>
+              </w:rPr>
+              <w:t xml:space="preserve">Appel en un clic</w:t>
             </w:r>
           </w:p>
         </w:tc>
@@ -531,10 +531,10 @@
                 <w:b w:val="false"/>
                 <w:bCs w:val="false"/>
                 <w:color w:val="15203A"/>
-                <w:sz w:val="19"/>
-                <w:szCs w:val="19"/>
-              </w:rPr>
-              <w:t xml:space="preserve">Liste courte (nom, catégorie, numéro principal) ; un toucher déroule la fiche complète : tous les numéros avec le nom de la personne, e-mails, adresse avec lien « Itinéraire », informations utiles (horaires, conditions d'accès, DDN…).</w:t>
+                <w:sz w:val="18"/>
+                <w:szCs w:val="18"/>
+              </w:rPr>
+              <w:t xml:space="preserve">Toucher un numéro lance l'appel depuis le téléphone, y compris les numéros courts (3114, 115…). Une icône permet aussi de le copier.</w:t>
             </w:r>
           </w:p>
         </w:tc>
@@ -569,10 +569,10 @@
                 <w:b w:val="false"/>
                 <w:bCs w:val="false"/>
                 <w:color w:val="15203A"/>
-                <w:sz w:val="19"/>
-                <w:szCs w:val="19"/>
-              </w:rPr>
-              <w:t xml:space="preserve">Mise à jour par l'équipe</w:t>
+                <w:sz w:val="18"/>
+                <w:szCs w:val="18"/>
+              </w:rPr>
+              <w:t xml:space="preserve">Partage d'une fiche</w:t>
             </w:r>
           </w:p>
         </w:tc>
@@ -602,10 +602,10 @@
                 <w:b w:val="false"/>
                 <w:bCs w:val="false"/>
                 <w:color w:val="15203A"/>
-                <w:sz w:val="19"/>
-                <w:szCs w:val="19"/>
-              </w:rPr>
-              <w:t xml:space="preserve">Bouton « Modifier » sur chaque fiche. Chaque numéro est une ligne à part : quand un professionnel part, on supprime sa ligne en un clic. Ajout de fiches et de catégories en quelques secondes.</w:t>
+                <w:sz w:val="18"/>
+                <w:szCs w:val="18"/>
+              </w:rPr>
+              <w:t xml:space="preserve">Bouton « Partager » : envoie le nom, les numéros, les e-mails et l'adresse par WhatsApp, SMS ou toute autre application. Les « infos utiles » internes ne sont jamais envoyées.</w:t>
             </w:r>
           </w:p>
         </w:tc>
@@ -639,10 +639,10 @@
                 <w:b w:val="false"/>
                 <w:bCs w:val="false"/>
                 <w:color w:val="15203A"/>
-                <w:sz w:val="19"/>
-                <w:szCs w:val="19"/>
-              </w:rPr>
-              <w:t xml:space="preserve">Modifications simultanées</w:t>
+                <w:sz w:val="18"/>
+                <w:szCs w:val="18"/>
+              </w:rPr>
+              <w:t xml:space="preserve">Fiches claires</w:t>
             </w:r>
           </w:p>
         </w:tc>
@@ -671,10 +671,10 @@
                 <w:b w:val="false"/>
                 <w:bCs w:val="false"/>
                 <w:color w:val="15203A"/>
-                <w:sz w:val="19"/>
-                <w:szCs w:val="19"/>
-              </w:rPr>
-              <w:t xml:space="preserve">Si deux collègues modifient la même fiche en même temps, l'application le signale, fusionne ce qui peut l'être et demande quoi garder en cas de désaccord. Aucune saisie n'est perdue.</w:t>
+                <w:sz w:val="18"/>
+                <w:szCs w:val="18"/>
+              </w:rPr>
+              <w:t xml:space="preserve">Liste courte (nom, catégorie, numéro principal) ; un toucher déroule la fiche : tous les numéros avec le nom de la personne, e-mails, adresse avec « Itinéraire », infos utiles (horaires, conditions d'accès, DDN…).</w:t>
             </w:r>
           </w:p>
         </w:tc>
@@ -709,10 +709,10 @@
                 <w:b w:val="false"/>
                 <w:bCs w:val="false"/>
                 <w:color w:val="15203A"/>
-                <w:sz w:val="19"/>
-                <w:szCs w:val="19"/>
-              </w:rPr>
-              <w:t xml:space="preserve">Historique et retour arrière</w:t>
+                <w:sz w:val="18"/>
+                <w:szCs w:val="18"/>
+              </w:rPr>
+              <w:t xml:space="preserve">Mise à jour par l'équipe</w:t>
             </w:r>
           </w:p>
         </w:tc>
@@ -742,10 +742,10 @@
                 <w:b w:val="false"/>
                 <w:bCs w:val="false"/>
                 <w:color w:val="15203A"/>
-                <w:sz w:val="19"/>
-                <w:szCs w:val="19"/>
-              </w:rPr>
-              <w:t xml:space="preserve">Chaque changement est conservé 7 jours avec son auteur, la date et l'ancienne valeur. Une erreur ou une suppression se répare d'un clic.</w:t>
+                <w:sz w:val="18"/>
+                <w:szCs w:val="18"/>
+              </w:rPr>
+              <w:t xml:space="preserve">Bouton « Modifier » sur chaque fiche. Chaque numéro est une ligne à part : quand un professionnel part, on supprime sa ligne en un clic. Ajout de fiches et de catégories en quelques secondes ; une catégorie se renomme ou se fusionne avec une autre d'un coup.</w:t>
             </w:r>
           </w:p>
         </w:tc>
@@ -779,10 +779,10 @@
                 <w:b w:val="false"/>
                 <w:bCs w:val="false"/>
                 <w:color w:val="15203A"/>
-                <w:sz w:val="19"/>
-                <w:szCs w:val="19"/>
-              </w:rPr>
-              <w:t xml:space="preserve">Fiabilité et sauvegarde</w:t>
+                <w:sz w:val="18"/>
+                <w:szCs w:val="18"/>
+              </w:rPr>
+              <w:t xml:space="preserve">Modifications simultanées</w:t>
             </w:r>
           </w:p>
         </w:tc>
@@ -811,10 +811,10 @@
                 <w:b w:val="false"/>
                 <w:bCs w:val="false"/>
                 <w:color w:val="15203A"/>
-                <w:sz w:val="19"/>
-                <w:szCs w:val="19"/>
-              </w:rPr>
-              <w:t xml:space="preserve">Chaque fiche indique sa date de mise à jour (plus d'un an : « à vérifier »). Export complet en fichier Excel à tout moment.</w:t>
+                <w:sz w:val="18"/>
+                <w:szCs w:val="18"/>
+              </w:rPr>
+              <w:t xml:space="preserve">Si deux collègues modifient la même fiche en même temps, l'application le signale, fusionne ce qui peut l'être et demande quoi garder en cas de désaccord. Aucune saisie n'est perdue.</w:t>
             </w:r>
           </w:p>
         </w:tc>
@@ -849,10 +849,10 @@
                 <w:b w:val="false"/>
                 <w:bCs w:val="false"/>
                 <w:color w:val="15203A"/>
-                <w:sz w:val="19"/>
-                <w:szCs w:val="19"/>
-              </w:rPr>
-              <w:t xml:space="preserve">Comme une appli, avec son guide</w:t>
+                <w:sz w:val="18"/>
+                <w:szCs w:val="18"/>
+              </w:rPr>
+              <w:t xml:space="preserve">Historique et sauvegarde</w:t>
             </w:r>
           </w:p>
         </w:tc>
@@ -882,10 +882,10 @@
                 <w:b w:val="false"/>
                 <w:bCs w:val="false"/>
                 <w:color w:val="15203A"/>
-                <w:sz w:val="19"/>
-                <w:szCs w:val="19"/>
-              </w:rPr>
-              <w:t xml:space="preserve">S'installe sur l'écran d'accueil du téléphone, sans store. Un guide pas à pas (bouton « ? ») s'ouvre à la première visite : obtenir l'accès, installer, se connecter.</w:t>
+                <w:sz w:val="18"/>
+                <w:szCs w:val="18"/>
+              </w:rPr>
+              <w:t xml:space="preserve">Chaque changement est conservé 30 jours avec son auteur, la date et l'ancienne valeur : une erreur se répare d'un clic. Chaque fiche indique sa date de mise à jour (plus d'un an : « à vérifier »). Export complet en fichier Excel à tout moment.</w:t>
             </w:r>
           </w:p>
         </w:tc>
@@ -919,8 +919,148 @@
                 <w:b w:val="false"/>
                 <w:bCs w:val="false"/>
                 <w:color w:val="15203A"/>
-                <w:sz w:val="19"/>
-                <w:szCs w:val="19"/>
+                <w:sz w:val="18"/>
+                <w:szCs w:val="18"/>
+              </w:rPr>
+              <w:t xml:space="preserve">Sans réseau</w:t>
+            </w:r>
+          </w:p>
+        </w:tc>
+        <w:tc>
+          <w:tcPr>
+            <w:tcW w:type="dxa" w:w="6938"/>
+            <w:tcBorders>
+              <w:top w:val="single" w:color="DADFE8" w:sz="4"/>
+              <w:left w:val="single" w:color="DADFE8" w:sz="4"/>
+              <w:bottom w:val="single" w:color="DADFE8" w:sz="4"/>
+              <w:right w:val="single" w:color="DADFE8" w:sz="4"/>
+            </w:tcBorders>
+            <w:tcMar>
+              <w:top w:type="dxa" w:w="80"/>
+              <w:left w:type="dxa" w:w="120"/>
+              <w:bottom w:type="dxa" w:w="80"/>
+              <w:right w:type="dxa" w:w="120"/>
+            </w:tcMar>
+          </w:tcPr>
+          <w:p>
+            <w:pPr>
+              <w:spacing w:after="0" w:line="252"/>
+            </w:pPr>
+            <w:r>
+              <w:rPr>
+                <w:b w:val="false"/>
+                <w:bCs w:val="false"/>
+                <w:color w:val="15203A"/>
+                <w:sz w:val="18"/>
+                <w:szCs w:val="18"/>
+              </w:rPr>
+              <w:t xml:space="preserve">Si le téléphone n'a pas de connexion (sous-sol, zone blanche), l'application affiche la dernière version de l'annuaire gardée sur le téléphone, en lecture seule, avec sa date.</w:t>
+            </w:r>
+          </w:p>
+        </w:tc>
+      </w:tr>
+      <w:tr>
+        <w:trPr>
+          <w:cantSplit/>
+        </w:trPr>
+        <w:tc>
+          <w:tcPr>
+            <w:tcW w:type="dxa" w:w="2700"/>
+            <w:tcBorders>
+              <w:top w:val="single" w:color="DADFE8" w:sz="4"/>
+              <w:left w:val="single" w:color="DADFE8" w:sz="4"/>
+              <w:bottom w:val="single" w:color="DADFE8" w:sz="4"/>
+              <w:right w:val="single" w:color="DADFE8" w:sz="4"/>
+            </w:tcBorders>
+            <w:shd w:fill="F5F7FB" w:color="auto" w:val="clear"/>
+            <w:tcMar>
+              <w:top w:type="dxa" w:w="80"/>
+              <w:left w:type="dxa" w:w="120"/>
+              <w:bottom w:type="dxa" w:w="80"/>
+              <w:right w:type="dxa" w:w="120"/>
+            </w:tcMar>
+          </w:tcPr>
+          <w:p>
+            <w:pPr>
+              <w:spacing w:after="0" w:line="252"/>
+            </w:pPr>
+            <w:r>
+              <w:rPr>
+                <w:b w:val="false"/>
+                <w:bCs w:val="false"/>
+                <w:color w:val="15203A"/>
+                <w:sz w:val="18"/>
+                <w:szCs w:val="18"/>
+              </w:rPr>
+              <w:t xml:space="preserve">Comme une appli, avec son guide</w:t>
+            </w:r>
+          </w:p>
+        </w:tc>
+        <w:tc>
+          <w:tcPr>
+            <w:tcW w:type="dxa" w:w="6938"/>
+            <w:tcBorders>
+              <w:top w:val="single" w:color="DADFE8" w:sz="4"/>
+              <w:left w:val="single" w:color="DADFE8" w:sz="4"/>
+              <w:bottom w:val="single" w:color="DADFE8" w:sz="4"/>
+              <w:right w:val="single" w:color="DADFE8" w:sz="4"/>
+            </w:tcBorders>
+            <w:shd w:fill="F5F7FB" w:color="auto" w:val="clear"/>
+            <w:tcMar>
+              <w:top w:type="dxa" w:w="80"/>
+              <w:left w:type="dxa" w:w="120"/>
+              <w:bottom w:type="dxa" w:w="80"/>
+              <w:right w:type="dxa" w:w="120"/>
+            </w:tcMar>
+          </w:tcPr>
+          <w:p>
+            <w:pPr>
+              <w:spacing w:after="0" w:line="252"/>
+            </w:pPr>
+            <w:r>
+              <w:rPr>
+                <w:b w:val="false"/>
+                <w:bCs w:val="false"/>
+                <w:color w:val="15203A"/>
+                <w:sz w:val="18"/>
+                <w:szCs w:val="18"/>
+              </w:rPr>
+              <w:t xml:space="preserve">S'installe sur l'écran d'accueil du téléphone, sans store : un bouton « Installer » sur Android, deux gestes sur iPhone. Un guide pas à pas (bouton « ? ») s'ouvre à la première visite : obtenir l'accès, installer, se connecter.</w:t>
+            </w:r>
+          </w:p>
+        </w:tc>
+      </w:tr>
+      <w:tr>
+        <w:trPr>
+          <w:cantSplit/>
+        </w:trPr>
+        <w:tc>
+          <w:tcPr>
+            <w:tcW w:type="dxa" w:w="2700"/>
+            <w:tcBorders>
+              <w:top w:val="single" w:color="DADFE8" w:sz="4"/>
+              <w:left w:val="single" w:color="DADFE8" w:sz="4"/>
+              <w:bottom w:val="single" w:color="DADFE8" w:sz="4"/>
+              <w:right w:val="single" w:color="DADFE8" w:sz="4"/>
+            </w:tcBorders>
+            <w:tcMar>
+              <w:top w:type="dxa" w:w="80"/>
+              <w:left w:type="dxa" w:w="120"/>
+              <w:bottom w:type="dxa" w:w="80"/>
+              <w:right w:type="dxa" w:w="120"/>
+            </w:tcMar>
+          </w:tcPr>
+          <w:p>
+            <w:pPr>
+              <w:spacing w:after="0" w:line="252"/>
+            </w:pPr>
+            <w:r>
+              <w:rPr>
+                <w:b w:val="false"/>
+                <w:bCs w:val="false"/>
+                <w:color w:val="15203A"/>
+                <w:sz w:val="18"/>
+                <w:szCs w:val="18"/>
               </w:rPr>
               <w:t xml:space="preserve">Gestion des accès</w:t>
             </w:r>
@@ -951,8 +1091,8 @@
                 <w:b w:val="false"/>
                 <w:bCs w:val="false"/>
                 <w:color w:val="15203A"/>
-                <w:sz w:val="19"/>
-                <w:szCs w:val="19"/>
+                <w:sz w:val="18"/>
+                <w:szCs w:val="18"/>
               </w:rPr>
               <w:t xml:space="preserve">Les administrateurs autorisent ou retirent une personne, et nomment d'autres administrateurs, directement depuis l'application, en quelques secondes.</w:t>
             </w:r>
@@ -976,7 +1116,7 @@
           <w:ilvl w:val="0"/>
           <w:numId w:val="2"/>
         </w:numPr>
-        <w:spacing w:after="60" w:line="264"/>
+        <w:spacing w:after="40" w:line="258"/>
       </w:pPr>
       <w:r>
         <w:rPr>
@@ -996,7 +1136,7 @@
           <w:ilvl w:val="0"/>
           <w:numId w:val="2"/>
         </w:numPr>
-        <w:spacing w:after="60" w:line="264"/>
+        <w:spacing w:after="40" w:line="258"/>
       </w:pPr>
       <w:r>
         <w:rPr>
@@ -1016,7 +1156,7 @@
           <w:ilvl w:val="0"/>
           <w:numId w:val="2"/>
         </w:numPr>
-        <w:spacing w:after="60" w:line="264"/>
+        <w:spacing w:after="40" w:line="258"/>
       </w:pPr>
       <w:r>
         <w:rPr>
@@ -1036,7 +1176,7 @@
           <w:ilvl w:val="0"/>
           <w:numId w:val="2"/>
         </w:numPr>
-        <w:spacing w:after="60" w:line="264"/>
+        <w:spacing w:after="40" w:line="258"/>
       </w:pPr>
       <w:r>
         <w:rPr>
@@ -1056,7 +1196,7 @@
           <w:ilvl w:val="0"/>
           <w:numId w:val="2"/>
         </w:numPr>
-        <w:spacing w:after="60" w:line="264"/>
+        <w:spacing w:after="40" w:line="258"/>
       </w:pPr>
       <w:r>
         <w:rPr>
@@ -1066,7 +1206,7 @@
         <w:t xml:space="preserve">Traçabilité. </w:t>
       </w:r>
       <w:r>
-        <w:t xml:space="preserve">On sait qui a modifié quoi et quand, sur les 7 derniers jours.</w:t>
+        <w:t xml:space="preserve">On sait qui a modifié quoi et quand, sur les 30 derniers jours.</w:t>
       </w:r>
     </w:p>
     <w:p>
@@ -1076,40 +1216,17 @@
           <w:ilvl w:val="0"/>
           <w:numId w:val="2"/>
         </w:numPr>
-        <w:spacing w:after="60" w:line="264"/>
-      </w:pPr>
-      <w:r>
-        <w:rPr>
-          <w:b/>
-          <w:bCs/>
-        </w:rPr>
-        <w:t xml:space="preserve">Aucune donnée patient. </w:t>
-      </w:r>
-      <w:r>
-        <w:t xml:space="preserve">L'annuaire ne contient que des coordonnées de structures et de professionnels partenaires : pas de nom de personne accompagnée, pas de donnée de santé.</w:t>
-      </w:r>
-    </w:p>
-    <w:p>
-      <w:pPr>
-        <w:spacing w:after="100" w:before="80"/>
-      </w:pPr>
-      <w:r>
-        <w:rPr>
-          <w:b/>
-          <w:bCs/>
-        </w:rPr>
-        <w:t xml:space="preserve">Points à valider avec la direction : </w:t>
-      </w:r>
-      <w:r>
-        <w:t xml:space="preserve">certaines fiches contiennent des numéros de portable de professionnels partenaires (à garder strictement interne, comme aujourd'hui), et l'hébergeur de la base (Supabase) doit être configuré en région Europe. L'outil n'a pas encore été examiné par un service informatique ; il est simple à auditer, le code étant lisible en entier.</w:t>
-      </w:r>
-    </w:p>
-    <w:p>
-      <w:pPr>
-        <w:pStyle w:val="Heading1"/>
-      </w:pPr>
-      <w:r>
-        <w:t xml:space="preserve">4. Coût et entretien</w:t>
+        <w:spacing w:after="40" w:line="258"/>
+      </w:pPr>
+      <w:r>
+        <w:rPr>
+          <w:b/>
+          <w:bCs/>
+        </w:rPr>
+        <w:t xml:space="preserve">Sur le téléphone, seulement le nécessaire. </w:t>
+      </w:r>
+      <w:r>
+        <w:t xml:space="preserve">Une copie de l'annuaire reste dans l'application pour la consultation sans réseau ; elle disparaît à la désinstallation. Les favoris et derniers appels de chacun ne sont visibles que par lui.</w:t>
       </w:r>
     </w:p>
     <w:p>
@@ -1119,17 +1236,40 @@
           <w:ilvl w:val="0"/>
           <w:numId w:val="2"/>
         </w:numPr>
-        <w:spacing w:after="60" w:line="264"/>
-      </w:pPr>
-      <w:r>
-        <w:rPr>
-          <w:b/>
-          <w:bCs/>
-        </w:rPr>
-        <w:t xml:space="preserve">Coût : 0 €. </w:t>
-      </w:r>
-      <w:r>
-        <w:t xml:space="preserve">L'application repose sur des services gratuits : GitHub pour la page, Supabase pour la base de données. Une offre payante (environ 25 $ par mois) existe si l'usage grandit.</w:t>
+        <w:spacing w:after="40" w:line="258"/>
+      </w:pPr>
+      <w:r>
+        <w:rPr>
+          <w:b/>
+          <w:bCs/>
+        </w:rPr>
+        <w:t xml:space="preserve">Aucune donnée patient. </w:t>
+      </w:r>
+      <w:r>
+        <w:t xml:space="preserve">L'annuaire ne contient que des coordonnées de structures et de professionnels partenaires : pas de nom de personne accompagnée, pas de donnée de santé.</w:t>
+      </w:r>
+    </w:p>
+    <w:p>
+      <w:pPr>
+        <w:spacing w:after="100" w:before="80"/>
+      </w:pPr>
+      <w:r>
+        <w:rPr>
+          <w:b/>
+          <w:bCs/>
+        </w:rPr>
+        <w:t xml:space="preserve">Points à valider avec la direction : </w:t>
+      </w:r>
+      <w:r>
+        <w:t xml:space="preserve">certaines fiches contiennent des portables de professionnels partenaires (à garder interne, comme aujourd'hui) ; la base (Supabase) doit être hébergée en Europe (région à vérifier dans le projet). L'outil n'a pas été examiné par un service informatique ; son code, court et lisible, est simple à auditer.</w:t>
+      </w:r>
+    </w:p>
+    <w:p>
+      <w:pPr>
+        <w:pStyle w:val="Heading1"/>
+      </w:pPr>
+      <w:r>
+        <w:t xml:space="preserve">4. Coût et entretien</w:t>
       </w:r>
     </w:p>
     <w:p>
@@ -1139,474 +1279,17 @@
           <w:ilvl w:val="0"/>
           <w:numId w:val="2"/>
         </w:numPr>
-        <w:spacing w:after="60" w:line="264"/>
-      </w:pPr>
-      <w:r>
-        <w:rPr>
-          <w:b/>
-          <w:bCs/>
-        </w:rPr>
-        <w:t xml:space="preserve">Entretien quasi nul. </w:t>
-      </w:r>
-      <w:r>
-        <w:t xml:space="preserve">Une tâche automatique vérifie chaque jour que la base répond et prévient par e-mail en cas de problème. Le seul travail régulier est celui de l'équipe : tenir les fiches à jour.</w:t>
-      </w:r>
-    </w:p>
-    <w:p>
-      <w:pPr>
-        <w:pStyle w:val="Heading1"/>
-      </w:pPr>
-      <w:r>
-        <w:t xml:space="preserve">5. Pérennité et transmission</w:t>
-      </w:r>
-    </w:p>
-    <w:p>
-      <w:pPr>
-        <w:spacing w:after="100" w:line="276"/>
-      </w:pPr>
-      <w:r>
-        <w:t xml:space="preserve">Pour que l'outil ne dépende pas d'une seule personne, tout est transmissible sans perte de données :</w:t>
-      </w:r>
-    </w:p>
-    <w:tbl>
-      <w:tblPr>
-        <w:tblW w:type="dxa" w:w="9638"/>
-        <w:tblBorders>
-          <w:top w:val="single" w:color="auto" w:sz="4"/>
-          <w:left w:val="single" w:color="auto" w:sz="4"/>
-          <w:bottom w:val="single" w:color="auto" w:sz="4"/>
-          <w:right w:val="single" w:color="auto" w:sz="4"/>
-          <w:insideH w:val="single" w:color="auto" w:sz="4"/>
-          <w:insideV w:val="single" w:color="auto" w:sz="4"/>
-        </w:tblBorders>
-      </w:tblPr>
-      <w:tblGrid>
-        <w:gridCol w:w="2300"/>
-        <w:gridCol w:w="2100"/>
-        <w:gridCol w:w="5238"/>
-      </w:tblGrid>
-      <w:tr>
-        <w:trPr>
-          <w:tblHeader/>
-        </w:trPr>
-        <w:tc>
-          <w:tcPr>
-            <w:tcW w:type="dxa" w:w="2300"/>
-            <w:tcBorders>
-              <w:top w:val="single" w:color="DADFE8" w:sz="4"/>
-              <w:left w:val="single" w:color="DADFE8" w:sz="4"/>
-              <w:bottom w:val="single" w:color="DADFE8" w:sz="4"/>
-              <w:right w:val="single" w:color="DADFE8" w:sz="4"/>
-            </w:tcBorders>
-            <w:shd w:fill="1F4D9E" w:color="auto" w:val="clear"/>
-            <w:tcMar>
-              <w:top w:type="dxa" w:w="80"/>
-              <w:left w:type="dxa" w:w="120"/>
-              <w:bottom w:type="dxa" w:w="80"/>
-              <w:right w:type="dxa" w:w="120"/>
-            </w:tcMar>
-          </w:tcPr>
-          <w:p>
-            <w:pPr>
-              <w:spacing w:after="0" w:line="252"/>
-            </w:pPr>
-            <w:r>
-              <w:rPr>
-                <w:b/>
-                <w:bCs/>
-                <w:color w:val="FFFFFF"/>
-                <w:sz w:val="19"/>
-                <w:szCs w:val="19"/>
-              </w:rPr>
-              <w:t xml:space="preserve">Élément</w:t>
-            </w:r>
-          </w:p>
-        </w:tc>
-        <w:tc>
-          <w:tcPr>
-            <w:tcW w:type="dxa" w:w="2100"/>
-            <w:tcBorders>
-              <w:top w:val="single" w:color="DADFE8" w:sz="4"/>
-              <w:left w:val="single" w:color="DADFE8" w:sz="4"/>
-              <w:bottom w:val="single" w:color="DADFE8" w:sz="4"/>
-              <w:right w:val="single" w:color="DADFE8" w:sz="4"/>
-            </w:tcBorders>
-            <w:shd w:fill="1F4D9E" w:color="auto" w:val="clear"/>
-            <w:tcMar>
-              <w:top w:type="dxa" w:w="80"/>
-              <w:left w:type="dxa" w:w="120"/>
-              <w:bottom w:type="dxa" w:w="80"/>
-              <w:right w:type="dxa" w:w="120"/>
-            </w:tcMar>
-          </w:tcPr>
-          <w:p>
-            <w:pPr>
-              <w:spacing w:after="0" w:line="252"/>
-            </w:pPr>
-            <w:r>
-              <w:rPr>
-                <w:b/>
-                <w:bCs/>
-                <w:color w:val="FFFFFF"/>
-                <w:sz w:val="19"/>
-                <w:szCs w:val="19"/>
-              </w:rPr>
-              <w:t xml:space="preserve">Où</w:t>
-            </w:r>
-          </w:p>
-        </w:tc>
-        <w:tc>
-          <w:tcPr>
-            <w:tcW w:type="dxa" w:w="5238"/>
-            <w:tcBorders>
-              <w:top w:val="single" w:color="DADFE8" w:sz="4"/>
-              <w:left w:val="single" w:color="DADFE8" w:sz="4"/>
-              <w:bottom w:val="single" w:color="DADFE8" w:sz="4"/>
-              <w:right w:val="single" w:color="DADFE8" w:sz="4"/>
-            </w:tcBorders>
-            <w:shd w:fill="1F4D9E" w:color="auto" w:val="clear"/>
-            <w:tcMar>
-              <w:top w:type="dxa" w:w="80"/>
-              <w:left w:type="dxa" w:w="120"/>
-              <w:bottom w:type="dxa" w:w="80"/>
-              <w:right w:type="dxa" w:w="120"/>
-            </w:tcMar>
-          </w:tcPr>
-          <w:p>
-            <w:pPr>
-              <w:spacing w:after="0" w:line="252"/>
-            </w:pPr>
-            <w:r>
-              <w:rPr>
-                <w:b/>
-                <w:bCs/>
-                <w:color w:val="FFFFFF"/>
-                <w:sz w:val="19"/>
-                <w:szCs w:val="19"/>
-              </w:rPr>
-              <w:t xml:space="preserve">Comment le transmettre</w:t>
-            </w:r>
-          </w:p>
-        </w:tc>
-      </w:tr>
-      <w:tr>
-        <w:trPr>
-          <w:cantSplit/>
-        </w:trPr>
-        <w:tc>
-          <w:tcPr>
-            <w:tcW w:type="dxa" w:w="2300"/>
-            <w:tcBorders>
-              <w:top w:val="single" w:color="DADFE8" w:sz="4"/>
-              <w:left w:val="single" w:color="DADFE8" w:sz="4"/>
-              <w:bottom w:val="single" w:color="DADFE8" w:sz="4"/>
-              <w:right w:val="single" w:color="DADFE8" w:sz="4"/>
-            </w:tcBorders>
-            <w:tcMar>
-              <w:top w:type="dxa" w:w="80"/>
-              <w:left w:type="dxa" w:w="120"/>
-              <w:bottom w:type="dxa" w:w="80"/>
-              <w:right w:type="dxa" w:w="120"/>
-            </w:tcMar>
-          </w:tcPr>
-          <w:p>
-            <w:pPr>
-              <w:spacing w:after="0" w:line="252"/>
-            </w:pPr>
-            <w:r>
-              <w:rPr>
-                <w:b w:val="false"/>
-                <w:bCs w:val="false"/>
-                <w:color w:val="15203A"/>
-                <w:sz w:val="19"/>
-                <w:szCs w:val="19"/>
-              </w:rPr>
-              <w:t xml:space="preserve">Les 201 fiches</w:t>
-            </w:r>
-          </w:p>
-        </w:tc>
-        <w:tc>
-          <w:tcPr>
-            <w:tcW w:type="dxa" w:w="2100"/>
-            <w:tcBorders>
-              <w:top w:val="single" w:color="DADFE8" w:sz="4"/>
-              <w:left w:val="single" w:color="DADFE8" w:sz="4"/>
-              <w:bottom w:val="single" w:color="DADFE8" w:sz="4"/>
-              <w:right w:val="single" w:color="DADFE8" w:sz="4"/>
-            </w:tcBorders>
-            <w:tcMar>
-              <w:top w:type="dxa" w:w="80"/>
-              <w:left w:type="dxa" w:w="120"/>
-              <w:bottom w:type="dxa" w:w="80"/>
-              <w:right w:type="dxa" w:w="120"/>
-            </w:tcMar>
-          </w:tcPr>
-          <w:p>
-            <w:pPr>
-              <w:spacing w:after="0" w:line="252"/>
-            </w:pPr>
-            <w:r>
-              <w:rPr>
-                <w:b w:val="false"/>
-                <w:bCs w:val="false"/>
-                <w:color w:val="15203A"/>
-                <w:sz w:val="19"/>
-                <w:szCs w:val="19"/>
-              </w:rPr>
-              <w:t xml:space="preserve">Base Supabase</w:t>
-            </w:r>
-          </w:p>
-        </w:tc>
-        <w:tc>
-          <w:tcPr>
-            <w:tcW w:type="dxa" w:w="5238"/>
-            <w:tcBorders>
-              <w:top w:val="single" w:color="DADFE8" w:sz="4"/>
-              <w:left w:val="single" w:color="DADFE8" w:sz="4"/>
-              <w:bottom w:val="single" w:color="DADFE8" w:sz="4"/>
-              <w:right w:val="single" w:color="DADFE8" w:sz="4"/>
-            </w:tcBorders>
-            <w:tcMar>
-              <w:top w:type="dxa" w:w="80"/>
-              <w:left w:type="dxa" w:w="120"/>
-              <w:bottom w:type="dxa" w:w="80"/>
-              <w:right w:type="dxa" w:w="120"/>
-            </w:tcMar>
-          </w:tcPr>
-          <w:p>
-            <w:pPr>
-              <w:spacing w:after="0" w:line="252"/>
-            </w:pPr>
-            <w:r>
-              <w:rPr>
-                <w:b w:val="false"/>
-                <w:bCs w:val="false"/>
-                <w:color w:val="15203A"/>
-                <w:sz w:val="19"/>
-                <w:szCs w:val="19"/>
-              </w:rPr>
-              <w:t xml:space="preserve">Inviter le nouveau responsable comme propriétaire, ou transférer le projet à son organisation.</w:t>
-            </w:r>
-          </w:p>
-        </w:tc>
-      </w:tr>
-      <w:tr>
-        <w:trPr>
-          <w:cantSplit/>
-        </w:trPr>
-        <w:tc>
-          <w:tcPr>
-            <w:tcW w:type="dxa" w:w="2300"/>
-            <w:tcBorders>
-              <w:top w:val="single" w:color="DADFE8" w:sz="4"/>
-              <w:left w:val="single" w:color="DADFE8" w:sz="4"/>
-              <w:bottom w:val="single" w:color="DADFE8" w:sz="4"/>
-              <w:right w:val="single" w:color="DADFE8" w:sz="4"/>
-            </w:tcBorders>
-            <w:shd w:fill="F5F7FB" w:color="auto" w:val="clear"/>
-            <w:tcMar>
-              <w:top w:type="dxa" w:w="80"/>
-              <w:left w:type="dxa" w:w="120"/>
-              <w:bottom w:type="dxa" w:w="80"/>
-              <w:right w:type="dxa" w:w="120"/>
-            </w:tcMar>
-          </w:tcPr>
-          <w:p>
-            <w:pPr>
-              <w:spacing w:after="0" w:line="252"/>
-            </w:pPr>
-            <w:r>
-              <w:rPr>
-                <w:b w:val="false"/>
-                <w:bCs w:val="false"/>
-                <w:color w:val="15203A"/>
-                <w:sz w:val="19"/>
-                <w:szCs w:val="19"/>
-              </w:rPr>
-              <w:t xml:space="preserve">La page de l'application</w:t>
-            </w:r>
-          </w:p>
-        </w:tc>
-        <w:tc>
-          <w:tcPr>
-            <w:tcW w:type="dxa" w:w="2100"/>
-            <w:tcBorders>
-              <w:top w:val="single" w:color="DADFE8" w:sz="4"/>
-              <w:left w:val="single" w:color="DADFE8" w:sz="4"/>
-              <w:bottom w:val="single" w:color="DADFE8" w:sz="4"/>
-              <w:right w:val="single" w:color="DADFE8" w:sz="4"/>
-            </w:tcBorders>
-            <w:shd w:fill="F5F7FB" w:color="auto" w:val="clear"/>
-            <w:tcMar>
-              <w:top w:type="dxa" w:w="80"/>
-              <w:left w:type="dxa" w:w="120"/>
-              <w:bottom w:type="dxa" w:w="80"/>
-              <w:right w:type="dxa" w:w="120"/>
-            </w:tcMar>
-          </w:tcPr>
-          <w:p>
-            <w:pPr>
-              <w:spacing w:after="0" w:line="252"/>
-            </w:pPr>
-            <w:r>
-              <w:rPr>
-                <w:b w:val="false"/>
-                <w:bCs w:val="false"/>
-                <w:color w:val="15203A"/>
-                <w:sz w:val="19"/>
-                <w:szCs w:val="19"/>
-              </w:rPr>
-              <w:t xml:space="preserve">GitHub (compte Bus3132)</w:t>
-            </w:r>
-          </w:p>
-        </w:tc>
-        <w:tc>
-          <w:tcPr>
-            <w:tcW w:type="dxa" w:w="5238"/>
-            <w:tcBorders>
-              <w:top w:val="single" w:color="DADFE8" w:sz="4"/>
-              <w:left w:val="single" w:color="DADFE8" w:sz="4"/>
-              <w:bottom w:val="single" w:color="DADFE8" w:sz="4"/>
-              <w:right w:val="single" w:color="DADFE8" w:sz="4"/>
-            </w:tcBorders>
-            <w:shd w:fill="F5F7FB" w:color="auto" w:val="clear"/>
-            <w:tcMar>
-              <w:top w:type="dxa" w:w="80"/>
-              <w:left w:type="dxa" w:w="120"/>
-              <w:bottom w:type="dxa" w:w="80"/>
-              <w:right w:type="dxa" w:w="120"/>
-            </w:tcMar>
-          </w:tcPr>
-          <w:p>
-            <w:pPr>
-              <w:spacing w:after="0" w:line="252"/>
-            </w:pPr>
-            <w:r>
-              <w:rPr>
-                <w:b w:val="false"/>
-                <w:bCs w:val="false"/>
-                <w:color w:val="15203A"/>
-                <w:sz w:val="19"/>
-                <w:szCs w:val="19"/>
-              </w:rPr>
-              <w:t xml:space="preserve">Déjà au nom de l'association : y ajouter le successeur. L'adresse ne change pas.</w:t>
-            </w:r>
-          </w:p>
-        </w:tc>
-      </w:tr>
-      <w:tr>
-        <w:trPr>
-          <w:cantSplit/>
-        </w:trPr>
-        <w:tc>
-          <w:tcPr>
-            <w:tcW w:type="dxa" w:w="2300"/>
-            <w:tcBorders>
-              <w:top w:val="single" w:color="DADFE8" w:sz="4"/>
-              <w:left w:val="single" w:color="DADFE8" w:sz="4"/>
-              <w:bottom w:val="single" w:color="DADFE8" w:sz="4"/>
-              <w:right w:val="single" w:color="DADFE8" w:sz="4"/>
-            </w:tcBorders>
-            <w:tcMar>
-              <w:top w:type="dxa" w:w="80"/>
-              <w:left w:type="dxa" w:w="120"/>
-              <w:bottom w:type="dxa" w:w="80"/>
-              <w:right w:type="dxa" w:w="120"/>
-            </w:tcMar>
-          </w:tcPr>
-          <w:p>
-            <w:pPr>
-              <w:spacing w:after="0" w:line="252"/>
-            </w:pPr>
-            <w:r>
-              <w:rPr>
-                <w:b w:val="false"/>
-                <w:bCs w:val="false"/>
-                <w:color w:val="15203A"/>
-                <w:sz w:val="19"/>
-                <w:szCs w:val="19"/>
-              </w:rPr>
-              <w:t xml:space="preserve">La gestion des accès</w:t>
-            </w:r>
-          </w:p>
-        </w:tc>
-        <w:tc>
-          <w:tcPr>
-            <w:tcW w:type="dxa" w:w="2100"/>
-            <w:tcBorders>
-              <w:top w:val="single" w:color="DADFE8" w:sz="4"/>
-              <w:left w:val="single" w:color="DADFE8" w:sz="4"/>
-              <w:bottom w:val="single" w:color="DADFE8" w:sz="4"/>
-              <w:right w:val="single" w:color="DADFE8" w:sz="4"/>
-            </w:tcBorders>
-            <w:tcMar>
-              <w:top w:type="dxa" w:w="80"/>
-              <w:left w:type="dxa" w:w="120"/>
-              <w:bottom w:type="dxa" w:w="80"/>
-              <w:right w:type="dxa" w:w="120"/>
-            </w:tcMar>
-          </w:tcPr>
-          <w:p>
-            <w:pPr>
-              <w:spacing w:after="0" w:line="252"/>
-            </w:pPr>
-            <w:r>
-              <w:rPr>
-                <w:b w:val="false"/>
-                <w:bCs w:val="false"/>
-                <w:color w:val="15203A"/>
-                <w:sz w:val="19"/>
-                <w:szCs w:val="19"/>
-              </w:rPr>
-              <w:t xml:space="preserve">Application (bouton Accès)</w:t>
-            </w:r>
-          </w:p>
-        </w:tc>
-        <w:tc>
-          <w:tcPr>
-            <w:tcW w:type="dxa" w:w="5238"/>
-            <w:tcBorders>
-              <w:top w:val="single" w:color="DADFE8" w:sz="4"/>
-              <w:left w:val="single" w:color="DADFE8" w:sz="4"/>
-              <w:bottom w:val="single" w:color="DADFE8" w:sz="4"/>
-              <w:right w:val="single" w:color="DADFE8" w:sz="4"/>
-            </w:tcBorders>
-            <w:tcMar>
-              <w:top w:type="dxa" w:w="80"/>
-              <w:left w:type="dxa" w:w="120"/>
-              <w:bottom w:type="dxa" w:w="80"/>
-              <w:right w:type="dxa" w:w="120"/>
-            </w:tcMar>
-          </w:tcPr>
-          <w:p>
-            <w:pPr>
-              <w:spacing w:after="0" w:line="252"/>
-            </w:pPr>
-            <w:r>
-              <w:rPr>
-                <w:b w:val="false"/>
-                <w:bCs w:val="false"/>
-                <w:color w:val="15203A"/>
-                <w:sz w:val="19"/>
-                <w:szCs w:val="19"/>
-              </w:rPr>
-              <w:t xml:space="preserve">Nommer le successeur administrateur dans l'application ; il peut ensuite retirer l'ancien.</w:t>
-            </w:r>
-          </w:p>
-        </w:tc>
-      </w:tr>
-    </w:tbl>
-    <w:p>
-      <w:pPr>
-        <w:spacing w:after="80"/>
-      </w:pPr>
-    </w:p>
-    <w:p>
-      <w:pPr>
-        <w:pStyle w:val="Heading1"/>
-      </w:pPr>
-      <w:r>
-        <w:t xml:space="preserve">6. Ce que je propose</w:t>
+        <w:spacing w:after="40" w:line="258"/>
+      </w:pPr>
+      <w:r>
+        <w:rPr>
+          <w:b/>
+          <w:bCs/>
+        </w:rPr>
+        <w:t xml:space="preserve">Coût : 0 €. </w:t>
+      </w:r>
+      <w:r>
+        <w:t xml:space="preserve">L'application repose sur des services gratuits : GitHub pour la page, Supabase pour la base de données. Une offre payante (environ 25 $ par mois) existe si l'usage grandit.</w:t>
       </w:r>
     </w:p>
     <w:p>
@@ -1616,17 +1299,33 @@
           <w:ilvl w:val="0"/>
           <w:numId w:val="2"/>
         </w:numPr>
-        <w:spacing w:after="60" w:line="264"/>
-      </w:pPr>
-      <w:r>
-        <w:rPr>
-          <w:b/>
-          <w:bCs/>
-        </w:rPr>
-        <w:t xml:space="preserve">Valider l'usage </w:t>
-      </w:r>
-      <w:r>
-        <w:t xml:space="preserve">de l'application par l'équipe.</w:t>
+        <w:spacing w:after="40" w:line="258"/>
+      </w:pPr>
+      <w:r>
+        <w:rPr>
+          <w:b/>
+          <w:bCs/>
+        </w:rPr>
+        <w:t xml:space="preserve">Entretien quasi nul. </w:t>
+      </w:r>
+      <w:r>
+        <w:t xml:space="preserve">Une tâche automatique vérifie chaque jour que la base répond et prévient par e-mail en cas de problème. Le seul travail régulier est celui de l'équipe : tenir les fiches à jour.</w:t>
+      </w:r>
+    </w:p>
+    <w:p>
+      <w:pPr>
+        <w:pStyle w:val="Heading1"/>
+      </w:pPr>
+      <w:r>
+        <w:t xml:space="preserve">5. Pérennité et transmission</w:t>
+      </w:r>
+    </w:p>
+    <w:p>
+      <w:pPr>
+        <w:spacing w:after="80" w:line="264"/>
+      </w:pPr>
+      <w:r>
+        <w:t xml:space="preserve">Pour que l'outil ne dépende pas d'une seule personne, tout est transmissible sans perte de données :</w:t>
       </w:r>
     </w:p>
     <w:p>
@@ -1636,17 +1335,17 @@
           <w:ilvl w:val="0"/>
           <w:numId w:val="2"/>
         </w:numPr>
-        <w:spacing w:after="60" w:line="264"/>
-      </w:pPr>
-      <w:r>
-        <w:rPr>
-          <w:b/>
-          <w:bCs/>
-        </w:rPr>
-        <w:t xml:space="preserve">Désigner un responsable </w:t>
-      </w:r>
-      <w:r>
-        <w:t xml:space="preserve">(mon chef de service), nommé administrateur et copropriétaire de l'outil dès maintenant, et non seulement le jour de mon départ.</w:t>
+        <w:spacing w:after="40" w:line="258"/>
+      </w:pPr>
+      <w:r>
+        <w:rPr>
+          <w:b/>
+          <w:bCs/>
+        </w:rPr>
+        <w:t xml:space="preserve">Les 201 fiches (base Supabase) : </w:t>
+      </w:r>
+      <w:r>
+        <w:t xml:space="preserve">inviter le nouveau responsable comme propriétaire, ou transférer le projet à son organisation.</w:t>
       </w:r>
     </w:p>
     <w:p>
@@ -1656,17 +1355,17 @@
           <w:ilvl w:val="0"/>
           <w:numId w:val="2"/>
         </w:numPr>
-        <w:spacing w:after="60" w:line="264"/>
-      </w:pPr>
-      <w:r>
-        <w:rPr>
-          <w:b/>
-          <w:bCs/>
-        </w:rPr>
-        <w:t xml:space="preserve">Garder les comptes au nom de l'association. </w:t>
-      </w:r>
-      <w:r>
-        <w:t xml:space="preserve">Le code l'est déjà (GitHub Bus3132) ; créer aussi le compte Supabase au nom de l'association.</w:t>
+        <w:spacing w:after="40" w:line="258"/>
+      </w:pPr>
+      <w:r>
+        <w:rPr>
+          <w:b/>
+          <w:bCs/>
+        </w:rPr>
+        <w:t xml:space="preserve">La page de l'application (GitHub, compte Bus3132) : </w:t>
+      </w:r>
+      <w:r>
+        <w:t xml:space="preserve">déjà au nom de l'association ; y ajouter le successeur. L'adresse ne change pas.</w:t>
       </w:r>
     </w:p>
     <w:p>
@@ -1676,7 +1375,95 @@
           <w:ilvl w:val="0"/>
           <w:numId w:val="2"/>
         </w:numPr>
-        <w:spacing w:after="60" w:line="264"/>
+        <w:spacing w:after="40" w:line="258"/>
+      </w:pPr>
+      <w:r>
+        <w:rPr>
+          <w:b/>
+          <w:bCs/>
+        </w:rPr>
+        <w:t xml:space="preserve">La gestion des accès (bouton Accès) : </w:t>
+      </w:r>
+      <w:r>
+        <w:t xml:space="preserve">nommer le successeur administrateur dans l'application ; il peut ensuite retirer l'ancien.</w:t>
+      </w:r>
+    </w:p>
+    <w:p>
+      <w:pPr>
+        <w:pStyle w:val="Heading1"/>
+      </w:pPr>
+      <w:r>
+        <w:t xml:space="preserve">6. Ce que je propose</w:t>
+      </w:r>
+    </w:p>
+    <w:p>
+      <w:pPr>
+        <w:pStyle w:val="ListParagraph"/>
+        <w:numPr>
+          <w:ilvl w:val="0"/>
+          <w:numId w:val="2"/>
+        </w:numPr>
+        <w:spacing w:after="40" w:line="258"/>
+      </w:pPr>
+      <w:r>
+        <w:rPr>
+          <w:b/>
+          <w:bCs/>
+        </w:rPr>
+        <w:t xml:space="preserve">Valider l'usage </w:t>
+      </w:r>
+      <w:r>
+        <w:t xml:space="preserve">de l'application par l'équipe.</w:t>
+      </w:r>
+    </w:p>
+    <w:p>
+      <w:pPr>
+        <w:pStyle w:val="ListParagraph"/>
+        <w:numPr>
+          <w:ilvl w:val="0"/>
+          <w:numId w:val="2"/>
+        </w:numPr>
+        <w:spacing w:after="40" w:line="258"/>
+      </w:pPr>
+      <w:r>
+        <w:rPr>
+          <w:b/>
+          <w:bCs/>
+        </w:rPr>
+        <w:t xml:space="preserve">Désigner un responsable </w:t>
+      </w:r>
+      <w:r>
+        <w:t xml:space="preserve">(mon chef de service), nommé administrateur et copropriétaire de l'outil dès maintenant, et non seulement le jour de mon départ.</w:t>
+      </w:r>
+    </w:p>
+    <w:p>
+      <w:pPr>
+        <w:pStyle w:val="ListParagraph"/>
+        <w:numPr>
+          <w:ilvl w:val="0"/>
+          <w:numId w:val="2"/>
+        </w:numPr>
+        <w:spacing w:after="40" w:line="258"/>
+      </w:pPr>
+      <w:r>
+        <w:rPr>
+          <w:b/>
+          <w:bCs/>
+        </w:rPr>
+        <w:t xml:space="preserve">Garder les comptes au nom de l'association. </w:t>
+      </w:r>
+      <w:r>
+        <w:t xml:space="preserve">Le code l'est déjà (GitHub Bus3132) ; créer aussi le compte Supabase au nom de l'association.</w:t>
+      </w:r>
+    </w:p>
+    <w:p>
+      <w:pPr>
+        <w:pStyle w:val="ListParagraph"/>
+        <w:numPr>
+          <w:ilvl w:val="0"/>
+          <w:numId w:val="2"/>
+        </w:numPr>
+        <w:spacing w:after="40" w:line="258"/>
       </w:pPr>
       <w:r>
         <w:rPr>
@@ -1809,7 +1596,7 @@
     </w:p>
     <w:p>
       <w:pPr>
-        <w:spacing w:after="100" w:line="276"/>
+        <w:spacing w:after="80" w:line="264"/>
       </w:pPr>
       <w:r>
         <w:rPr>
@@ -1882,8 +1669,8 @@
                 <w:b/>
                 <w:bCs/>
                 <w:color w:val="FFFFFF"/>
-                <w:sz w:val="19"/>
-                <w:szCs w:val="19"/>
+                <w:sz w:val="18"/>
+                <w:szCs w:val="18"/>
               </w:rPr>
               <w:t xml:space="preserve">Sur iPhone</w:t>
             </w:r>
@@ -1915,8 +1702,8 @@
                 <w:b/>
                 <w:bCs/>
                 <w:color w:val="FFFFFF"/>
-                <w:sz w:val="19"/>
-                <w:szCs w:val="19"/>
+                <w:sz w:val="18"/>
+                <w:szCs w:val="18"/>
               </w:rPr>
               <w:t xml:space="preserve">Sur Android</w:t>
             </w:r>
@@ -1952,8 +1739,8 @@
                 <w:b w:val="false"/>
                 <w:bCs w:val="false"/>
                 <w:color w:val="15203A"/>
-                <w:sz w:val="19"/>
-                <w:szCs w:val="19"/>
+                <w:sz w:val="18"/>
+                <w:szCs w:val="18"/>
               </w:rPr>
               <w:t xml:space="preserve">1. Ouvrir le lien dans Safari.</w:t>
             </w:r>
@@ -1967,8 +1754,8 @@
                 <w:b w:val="false"/>
                 <w:bCs w:val="false"/>
                 <w:color w:val="15203A"/>
-                <w:sz w:val="19"/>
-                <w:szCs w:val="19"/>
+                <w:sz w:val="18"/>
+                <w:szCs w:val="18"/>
               </w:rPr>
               <w:t xml:space="preserve">2. Bouton Partager (carré avec une flèche) &gt; « Sur l'écran d'accueil ». L'icône de l'annuaire apparaît.</w:t>
             </w:r>
@@ -1982,8 +1769,8 @@
                 <w:b w:val="false"/>
                 <w:bCs w:val="false"/>
                 <w:color w:val="15203A"/>
-                <w:sz w:val="19"/>
-                <w:szCs w:val="19"/>
+                <w:sz w:val="18"/>
+                <w:szCs w:val="18"/>
               </w:rPr>
               <w:t xml:space="preserve">3. Fermer Safari et ouvrir l'application depuis cette icône.</w:t>
             </w:r>
@@ -2014,8 +1801,8 @@
                 <w:b w:val="false"/>
                 <w:bCs w:val="false"/>
                 <w:color w:val="15203A"/>
-                <w:sz w:val="19"/>
-                <w:szCs w:val="19"/>
+                <w:sz w:val="18"/>
+                <w:szCs w:val="18"/>
               </w:rPr>
               <w:t xml:space="preserve">1. Ouvrir le lien dans Chrome.</w:t>
             </w:r>
@@ -2029,23 +1816,23 @@
                 <w:b w:val="false"/>
                 <w:bCs w:val="false"/>
                 <w:color w:val="15203A"/>
-                <w:sz w:val="19"/>
-                <w:szCs w:val="19"/>
-              </w:rPr>
-              <w:t xml:space="preserve">2. Menu ⋮ &gt; « Ajouter à l'écran d'accueil » (ou « Installer l'application »).</w:t>
-            </w:r>
-          </w:p>
-          <w:p>
-            <w:pPr>
-              <w:spacing w:after="0" w:line="252"/>
-            </w:pPr>
-            <w:r>
-              <w:rPr>
-                <w:b w:val="false"/>
-                <w:bCs w:val="false"/>
-                <w:color w:val="15203A"/>
-                <w:sz w:val="19"/>
-                <w:szCs w:val="19"/>
+                <w:sz w:val="18"/>
+                <w:szCs w:val="18"/>
+              </w:rPr>
+              <w:t xml:space="preserve">2. Toucher le bouton jaune « Installer l'application », puis confirmer. (S'il n'apparaît pas : menu ⋮ &gt; « Ajouter à l'écran d'accueil ».)</w:t>
+            </w:r>
+          </w:p>
+          <w:p>
+            <w:pPr>
+              <w:spacing w:after="0" w:line="252"/>
+            </w:pPr>
+            <w:r>
+              <w:rPr>
+                <w:b w:val="false"/>
+                <w:bCs w:val="false"/>
+                <w:color w:val="15203A"/>
+                <w:sz w:val="18"/>
+                <w:szCs w:val="18"/>
               </w:rPr>
               <w:t xml:space="preserve">3. Ouvrir l'application depuis l'icône de l'annuaire.</w:t>
             </w:r>
@@ -2157,7 +1944,7 @@
     </w:p>
     <w:p>
       <w:pPr>
-        <w:spacing w:after="100" w:line="276"/>
+        <w:spacing w:after="80" w:line="264"/>
       </w:pPr>
       <w:r>
         <w:t xml:space="preserve">Ensuite, on reste connecté sur ce téléphone : plus besoin de recommencer, sauf en cas de déconnexion ou de changement de téléphone.</w:t>
@@ -2225,8 +2012,8 @@
                 <w:b/>
                 <w:bCs/>
                 <w:color w:val="FFFFFF"/>
-                <w:sz w:val="19"/>
-                <w:szCs w:val="19"/>
+                <w:sz w:val="18"/>
+                <w:szCs w:val="18"/>
               </w:rPr>
               <w:t xml:space="preserve">Message ou situation</w:t>
             </w:r>
@@ -2258,8 +2045,8 @@
                 <w:b/>
                 <w:bCs/>
                 <w:color w:val="FFFFFF"/>
-                <w:sz w:val="19"/>
-                <w:szCs w:val="19"/>
+                <w:sz w:val="18"/>
+                <w:szCs w:val="18"/>
               </w:rPr>
               <w:t xml:space="preserve">Que faire</w:t>
             </w:r>
@@ -2295,8 +2082,8 @@
                 <w:b w:val="false"/>
                 <w:bCs w:val="false"/>
                 <w:color w:val="15203A"/>
-                <w:sz w:val="19"/>
-                <w:szCs w:val="19"/>
+                <w:sz w:val="18"/>
+                <w:szCs w:val="18"/>
               </w:rPr>
               <w:t xml:space="preserve">« Adresse pas encore autorisée »</w:t>
             </w:r>
@@ -2327,8 +2114,8 @@
                 <w:b w:val="false"/>
                 <w:bCs w:val="false"/>
                 <w:color w:val="15203A"/>
-                <w:sz w:val="19"/>
-                <w:szCs w:val="19"/>
+                <w:sz w:val="18"/>
+                <w:szCs w:val="18"/>
               </w:rPr>
               <w:t xml:space="preserve">Le gestionnaire n'a pas fait l'étape 1, ou l'adresse est mal orthographiée dans la table membres.</w:t>
             </w:r>
@@ -2365,8 +2152,8 @@
                 <w:b w:val="false"/>
                 <w:bCs w:val="false"/>
                 <w:color w:val="15203A"/>
-                <w:sz w:val="19"/>
-                <w:szCs w:val="19"/>
+                <w:sz w:val="18"/>
+                <w:szCs w:val="18"/>
               </w:rPr>
               <w:t xml:space="preserve">Aucun mail reçu</w:t>
             </w:r>
@@ -2398,10 +2185,10 @@
                 <w:b w:val="false"/>
                 <w:bCs w:val="false"/>
                 <w:color w:val="15203A"/>
-                <w:sz w:val="19"/>
-                <w:szCs w:val="19"/>
-              </w:rPr>
-              <w:t xml:space="preserve">Regarder les spams. Le service gratuit n'envoie que quelques mails par heure : faire arriver les collègues un par un, pas toute l'équipe le même matin.</w:t>
+                <w:sz w:val="18"/>
+                <w:szCs w:val="18"/>
+              </w:rPr>
+              <w:t xml:space="preserve">Regarder les spams, et vérifier que l'adresse tapée est bien celle qui a été autorisée. Le gestionnaire peut voir dans Supabase (Logs &gt; Auth) si le mail est parti.</w:t>
             </w:r>
           </w:p>
         </w:tc>
@@ -2435,8 +2222,8 @@
                 <w:b w:val="false"/>
                 <w:bCs w:val="false"/>
                 <w:color w:val="15203A"/>
-                <w:sz w:val="19"/>
-                <w:szCs w:val="19"/>
+                <w:sz w:val="18"/>
+                <w:szCs w:val="18"/>
               </w:rPr>
               <w:t xml:space="preserve">« Code incorrect ou expiré »</w:t>
             </w:r>
@@ -2467,8 +2254,8 @@
                 <w:b w:val="false"/>
                 <w:bCs w:val="false"/>
                 <w:color w:val="15203A"/>
-                <w:sz w:val="19"/>
-                <w:szCs w:val="19"/>
+                <w:sz w:val="18"/>
+                <w:szCs w:val="18"/>
               </w:rPr>
               <w:t xml:space="preserve">Le code n'est valable que peu de temps. Toucher « Changer d'adresse » et redemander un mail.</w:t>
             </w:r>
@@ -2505,8 +2292,8 @@
                 <w:b w:val="false"/>
                 <w:bCs w:val="false"/>
                 <w:color w:val="15203A"/>
-                <w:sz w:val="19"/>
-                <w:szCs w:val="19"/>
+                <w:sz w:val="18"/>
+                <w:szCs w:val="18"/>
               </w:rPr>
               <w:t xml:space="preserve">Connecté dans Safari mais pas dans l'appli</w:t>
             </w:r>
@@ -2538,8 +2325,8 @@
                 <w:b w:val="false"/>
                 <w:bCs w:val="false"/>
                 <w:color w:val="15203A"/>
-                <w:sz w:val="19"/>
-                <w:szCs w:val="19"/>
+                <w:sz w:val="18"/>
+                <w:szCs w:val="18"/>
               </w:rPr>
               <w:t xml:space="preserve">Cas typique de l'iPhone quand on a touché le lien : recommencer depuis l'icône de l'application et utiliser le code.</w:t>
             </w:r>
@@ -2634,8 +2421,8 @@
                 <w:b/>
                 <w:bCs/>
                 <w:color w:val="FFFFFF"/>
-                <w:sz w:val="19"/>
-                <w:szCs w:val="19"/>
+                <w:sz w:val="18"/>
+                <w:szCs w:val="18"/>
               </w:rPr>
               <w:t xml:space="preserve">Outil</w:t>
             </w:r>
@@ -2667,8 +2454,8 @@
                 <w:b/>
                 <w:bCs/>
                 <w:color w:val="FFFFFF"/>
-                <w:sz w:val="19"/>
-                <w:szCs w:val="19"/>
+                <w:sz w:val="18"/>
+                <w:szCs w:val="18"/>
               </w:rPr>
               <w:t xml:space="preserve">Ce qu'il contient</w:t>
             </w:r>
@@ -2700,8 +2487,8 @@
                 <w:b/>
                 <w:bCs/>
                 <w:color w:val="FFFFFF"/>
-                <w:sz w:val="19"/>
-                <w:szCs w:val="19"/>
+                <w:sz w:val="18"/>
+                <w:szCs w:val="18"/>
               </w:rPr>
               <w:t xml:space="preserve">Adresse</w:t>
             </w:r>
@@ -2737,8 +2524,8 @@
                 <w:b w:val="false"/>
                 <w:bCs w:val="false"/>
                 <w:color w:val="15203A"/>
-                <w:sz w:val="19"/>
-                <w:szCs w:val="19"/>
+                <w:sz w:val="18"/>
+                <w:szCs w:val="18"/>
               </w:rPr>
               <w:t xml:space="preserve">GitHub</w:t>
             </w:r>
@@ -2769,8 +2556,8 @@
                 <w:b w:val="false"/>
                 <w:bCs w:val="false"/>
                 <w:color w:val="15203A"/>
-                <w:sz w:val="19"/>
-                <w:szCs w:val="19"/>
+                <w:sz w:val="18"/>
+                <w:szCs w:val="18"/>
               </w:rPr>
               <w:t xml:space="preserve">La page de l'application (le code) et la tâche automatique quotidienne. Aucun contact.</w:t>
             </w:r>
@@ -2801,8 +2588,8 @@
                 <w:b w:val="false"/>
                 <w:bCs w:val="false"/>
                 <w:color w:val="15203A"/>
-                <w:sz w:val="19"/>
-                <w:szCs w:val="19"/>
+                <w:sz w:val="18"/>
+                <w:szCs w:val="18"/>
               </w:rPr>
               <w:t xml:space="preserve">github.com/Bus3132/Annubus (compte de l'association)</w:t>
             </w:r>
@@ -2839,8 +2626,8 @@
                 <w:b w:val="false"/>
                 <w:bCs w:val="false"/>
                 <w:color w:val="15203A"/>
-                <w:sz w:val="19"/>
-                <w:szCs w:val="19"/>
+                <w:sz w:val="18"/>
+                <w:szCs w:val="18"/>
               </w:rPr>
               <w:t xml:space="preserve">Supabase</w:t>
             </w:r>
@@ -2872,10 +2659,10 @@
                 <w:b w:val="false"/>
                 <w:bCs w:val="false"/>
                 <w:color w:val="15203A"/>
-                <w:sz w:val="19"/>
-                <w:szCs w:val="19"/>
-              </w:rPr>
-              <w:t xml:space="preserve">Les fiches, la liste des membres, l'historique de 7 jours, les réglages de connexion.</w:t>
+                <w:sz w:val="18"/>
+                <w:szCs w:val="18"/>
+              </w:rPr>
+              <w:t xml:space="preserve">Les fiches, la liste des membres, les favoris, l'historique de 30 jours, les réglages de connexion et d'envoi des e-mails.</w:t>
             </w:r>
           </w:p>
         </w:tc>
@@ -2905,8 +2692,8 @@
                 <w:b w:val="false"/>
                 <w:bCs w:val="false"/>
                 <w:color w:val="15203A"/>
-                <w:sz w:val="19"/>
-                <w:szCs w:val="19"/>
+                <w:sz w:val="18"/>
+                <w:szCs w:val="18"/>
               </w:rPr>
               <w:t xml:space="preserve">supabase.com &gt; projet de l'annuaire</w:t>
             </w:r>
@@ -2957,7 +2744,7 @@
           <w:ilvl w:val="0"/>
           <w:numId w:val="2"/>
         </w:numPr>
-        <w:spacing w:after="60" w:line="264"/>
+        <w:spacing w:after="40" w:line="258"/>
       </w:pPr>
       <w:r>
         <w:rPr>
@@ -2977,7 +2764,7 @@
           <w:ilvl w:val="0"/>
           <w:numId w:val="2"/>
         </w:numPr>
-        <w:spacing w:after="60" w:line="264"/>
+        <w:spacing w:after="40" w:line="258"/>
       </w:pPr>
       <w:r>
         <w:rPr>
@@ -2997,7 +2784,7 @@
           <w:ilvl w:val="0"/>
           <w:numId w:val="2"/>
         </w:numPr>
-        <w:spacing w:after="60" w:line="264"/>
+        <w:spacing w:after="40" w:line="258"/>
       </w:pPr>
       <w:r>
         <w:rPr>
@@ -3017,17 +2804,17 @@
           <w:ilvl w:val="0"/>
           <w:numId w:val="2"/>
         </w:numPr>
-        <w:spacing w:after="60" w:line="264"/>
-      </w:pPr>
-      <w:r>
-        <w:rPr>
-          <w:b/>
-          <w:bCs/>
-        </w:rPr>
-        <w:t xml:space="preserve">Base gardée active : </w:t>
-      </w:r>
-      <w:r>
-        <w:t xml:space="preserve">la tâche « Annubus - garder la base active » (GitHub &gt; onglet Actions) interroge la base chaque matin. Pour la tester : Actions &gt; la tâche &gt; Run workflow.</w:t>
+        <w:spacing w:after="40" w:line="258"/>
+      </w:pPr>
+      <w:r>
+        <w:rPr>
+          <w:b/>
+          <w:bCs/>
+        </w:rPr>
+        <w:t xml:space="preserve">E-mails de connexion : </w:t>
+      </w:r>
+      <w:r>
+        <w:t xml:space="preserve">ils partent par le compte Gmail réglé dans Supabase &gt; Authentication &gt; SMTP Settings. Si plus personne ne reçoit de mail, vérifier ce réglage (mot de passe d'application Gmail) et Supabase &gt; Logs &gt; Auth.</w:t>
       </w:r>
     </w:p>
     <w:p>
@@ -3037,7 +2824,27 @@
           <w:ilvl w:val="0"/>
           <w:numId w:val="2"/>
         </w:numPr>
-        <w:spacing w:after="60" w:line="264"/>
+        <w:spacing w:after="40" w:line="258"/>
+      </w:pPr>
+      <w:r>
+        <w:rPr>
+          <w:b/>
+          <w:bCs/>
+        </w:rPr>
+        <w:t xml:space="preserve">Base gardée active : </w:t>
+      </w:r>
+      <w:r>
+        <w:t xml:space="preserve">la tâche « Annubus - garder la base active » (GitHub &gt; onglet Actions) interroge la base chaque matin. Pour la tester : Actions &gt; la tâche &gt; Run workflow.</w:t>
+      </w:r>
+    </w:p>
+    <w:p>
+      <w:pPr>
+        <w:pStyle w:val="ListParagraph"/>
+        <w:numPr>
+          <w:ilvl w:val="0"/>
+          <w:numId w:val="2"/>
+        </w:numPr>
+        <w:spacing w:after="40" w:line="258"/>
       </w:pPr>
       <w:r>
         <w:rPr>
@@ -3139,7 +2946,7 @@
     <w:sectPr>
       <w:footerReference w:type="default" r:id="rId7"/>
       <w:pgSz w:w="11906" w:h="16838" w:orient="portrait"/>
-      <w:pgMar w:top="1000" w:right="1134" w:bottom="1000" w:left="1134" w:header="708" w:footer="708" w:gutter="0"/>
+      <w:pgMar w:top="850" w:right="1134" w:bottom="850" w:left="1134" w:header="708" w:footer="708" w:gutter="0"/>
       <w:pgNumType/>
       <w:docGrid w:linePitch="360"/>
     </w:sectPr>
@@ -3529,8 +3336,8 @@
       <w:rPr>
         <w:rFonts w:ascii="Arial" w:cs="Arial" w:eastAsia="Arial" w:hAnsi="Arial"/>
         <w:color w:val="15203A"/>
-        <w:sz w:val="21"/>
-        <w:szCs w:val="21"/>
+        <w:sz w:val="20"/>
+        <w:szCs w:val="20"/>
       </w:rPr>
     </w:rPrDefault>
     <w:pPrDefault/>
@@ -3715,7 +3522,7 @@
       <w:pBdr>
         <w:bottom w:val="single" w:color="F3A21B" w:sz="6" w:space="2"/>
       </w:pBdr>
-      <w:spacing w:after="100" w:before="260"/>
+      <w:spacing w:after="80" w:before="200"/>
       <w:outlineLvl w:val="0"/>
     </w:pPr>
     <w:rPr>

</xml_diff>

<commit_message>
Annubus : détection des doublons (même numéro ou nom proche) et rapport ; note mise à jour
Co-Authored-By: Claude Fable 5.1 <noreply@anthropic.com>
Claude-Session: https://claude.ai/code/session_017Kbm7EwQptZrFZ4WUSTth2
</commit_message>
<xml_diff>
--- a/docs/Annubus_presentation.docx
+++ b/docs/Annubus_presentation.docx
@@ -745,7 +745,7 @@
                 <w:sz w:val="18"/>
                 <w:szCs w:val="18"/>
               </w:rPr>
-              <w:t xml:space="preserve">Bouton « Modifier » sur chaque fiche. Chaque numéro est une ligne à part : quand un professionnel part, on supprime sa ligne en un clic. Ajout de fiches et de catégories en quelques secondes ; une catégorie se renomme ou se fusionne avec une autre d'un coup.</w:t>
+              <w:t xml:space="preserve">Bouton « Modifier » sur chaque fiche ; chaque numéro est une ligne à part, supprimée en un clic quand un professionnel part. Catégories créées, renommées ou fusionnées en quelques secondes. Si un numéro ou un nom existe déjà, l'application le signale avant d'enregistrer (anti-doublons).</w:t>
             </w:r>
           </w:p>
         </w:tc>
@@ -1261,7 +1261,7 @@
         <w:t xml:space="preserve">Points à valider avec la direction : </w:t>
       </w:r>
       <w:r>
-        <w:t xml:space="preserve">certaines fiches contiennent des portables de professionnels partenaires (à garder interne, comme aujourd'hui) ; la base (Supabase) doit être hébergée en Europe (région à vérifier dans le projet). L'outil n'a pas été examiné par un service informatique ; son code, court et lisible, est simple à auditer.</w:t>
+        <w:t xml:space="preserve">certaines fiches contiennent des portables de professionnels partenaires (à garder interne, comme aujourd'hui) ; la base (Supabase) doit être hébergée en Europe. L'outil n'a pas été examiné par un service informatique ; son code, court et lisible, est simple à auditer.</w:t>
       </w:r>
     </w:p>
     <w:p>

</xml_diff>

<commit_message>
Note : installation sur ordinateur, cadre de commentaires
Co-Authored-By: Claude Opus 5.5 <noreply@anthropic.com>
Claude-Session: https://claude.ai/code/session_017Kbm7EwQptZrFZ4WUSTth2
</commit_message>
<xml_diff>
--- a/docs/Annubus_presentation.docx
+++ b/docs/Annubus_presentation.docx
@@ -128,7 +128,7 @@
                 <w:sz w:val="20"/>
                 <w:szCs w:val="20"/>
               </w:rPr>
-              <w:t xml:space="preserve">Note de présentation · version du 24 octobre 2026 · Julien Aron</w:t>
+              <w:t xml:space="preserve">Note de présentation · version du 26 octobre 2026 · Julien Aron</w:t>
             </w:r>
           </w:p>
         </w:tc>
@@ -156,7 +156,7 @@
         <w:t xml:space="preserve">En bref. </w:t>
       </w:r>
       <w:r>
-        <w:t xml:space="preserve">Une application web, utilisable sur téléphone comme sur ordinateur, qui regroupe les 201 contacts partenaires de l'équipe (CMP, CSAPA, hébergement, LHSS, urgences, médecins…), déjà repris et vérifiés. On y trouve un numéro en quelques secondes, on appelle d'un clic, chacun garde ses favoris et ses derniers appels sous la main, et toute l'équipe peut la tenir à jour. Elle est réservée aux membres de l'équipe, reste consultable sans réseau et ne coûte rien.</w:t>
+        <w:t xml:space="preserve">Une application web, utilisable sur téléphone comme sur ordinateur (où elle s'installe aussi), qui regroupe les 201 contacts partenaires de l'équipe (CMP, CSAPA, hébergement, LHSS, urgences, médecins…), déjà repris et vérifiés. On y trouve un numéro en quelques secondes, on appelle d'un clic, chacun garde ses favoris et ses derniers appels sous la main, et toute l'équipe peut la tenir à jour. Elle est réservée aux membres de l'équipe, reste consultable sans réseau et ne coûte rien.</w:t>
       </w:r>
     </w:p>
     <w:p>
@@ -954,7 +954,7 @@
                 <w:sz w:val="18"/>
                 <w:szCs w:val="18"/>
               </w:rPr>
-              <w:t xml:space="preserve">Si le téléphone n'a pas de connexion (sous-sol, zone blanche), l'application affiche la dernière version de l'annuaire gardée sur le téléphone, en lecture seule, avec sa date.</w:t>
+              <w:t xml:space="preserve">Sans connexion (sous-sol, zone blanche), l'appli affiche la dernière version gardée sur l'appareil, en lecture seule.</w:t>
             </w:r>
           </w:p>
         </w:tc>
@@ -1025,7 +1025,7 @@
                 <w:sz w:val="18"/>
                 <w:szCs w:val="18"/>
               </w:rPr>
-              <w:t xml:space="preserve">S'installe sur l'écran d'accueil du téléphone, sans store : un bouton « Installer » sur Android, deux gestes sur iPhone. Un guide pas à pas (bouton « ? ») s'ouvre à la première visite : obtenir l'accès, installer, se connecter.</w:t>
+              <w:t xml:space="preserve">S'installe sans store sur téléphone et sur ordinateur, une même adresse servant sur plusieurs appareils. Un guide (bouton « ? ») s'ouvre à la première visite.</w:t>
             </w:r>
           </w:p>
         </w:tc>
@@ -1094,7 +1094,7 @@
                 <w:sz w:val="18"/>
                 <w:szCs w:val="18"/>
               </w:rPr>
-              <w:t xml:space="preserve">Les administrateurs autorisent ou retirent une personne, et nomment d'autres administrateurs, directement depuis l'application, en quelques secondes.</w:t>
+              <w:t xml:space="preserve">Les administrateurs autorisent ou retirent une personne et nomment d'autres administrateurs depuis l'appli.</w:t>
             </w:r>
           </w:p>
         </w:tc>
@@ -1840,6 +1840,21 @@
         </w:tc>
       </w:tr>
     </w:tbl>
+    <w:p>
+      <w:pPr>
+        <w:spacing w:after="60" w:before="80"/>
+      </w:pPr>
+      <w:r>
+        <w:rPr>
+          <w:b/>
+          <w:bCs/>
+        </w:rPr>
+        <w:t xml:space="preserve">Sur ordinateur : </w:t>
+      </w:r>
+      <w:r>
+        <w:t xml:space="preserve">ouvrir le lien dans Chrome ou Edge, cliquer sur « Installer » (en haut de l'appli, ou l'icône à droite de la barre d'adresse). Annubus s'ouvre alors dans sa propre fenêtre et peut être épinglé à la barre des tâches. Une même adresse (par exemple une adresse générique de service) peut servir sur plusieurs ordinateurs : on se connecte une fois par poste.</w:t>
+      </w:r>
+    </w:p>
     <w:p>
       <w:pPr>
         <w:keepNext/>
@@ -2943,6 +2958,62 @@
         <w:t xml:space="preserve">nommer le successeur administrateur (bouton Accès) ; il retire ensuite l'accès de l'ancien gestionnaire.</w:t>
       </w:r>
     </w:p>
+    <w:p>
+      <w:pPr>
+        <w:keepNext/>
+        <w:spacing w:after="60" w:before="150"/>
+      </w:pPr>
+      <w:r>
+        <w:rPr>
+          <w:b/>
+          <w:bCs/>
+          <w:color w:val="15203A"/>
+          <w:sz w:val="22"/>
+          <w:szCs w:val="22"/>
+        </w:rPr>
+        <w:t xml:space="preserve">Commentaires</w:t>
+      </w:r>
+    </w:p>
+    <w:tbl>
+      <w:tblPr>
+        <w:tblW w:type="dxa" w:w="9638"/>
+        <w:tblBorders>
+          <w:top w:val="single" w:color="auto" w:sz="4"/>
+          <w:left w:val="single" w:color="auto" w:sz="4"/>
+          <w:bottom w:val="single" w:color="auto" w:sz="4"/>
+          <w:right w:val="single" w:color="auto" w:sz="4"/>
+          <w:insideH w:val="single" w:color="auto" w:sz="4"/>
+          <w:insideV w:val="single" w:color="auto" w:sz="4"/>
+        </w:tblBorders>
+      </w:tblPr>
+      <w:tblGrid>
+        <w:gridCol w:w="9638"/>
+      </w:tblGrid>
+      <w:tr>
+        <w:trPr>
+          <w:cantSplit/>
+          <w:trHeight w:val="3000" w:hRule="atLeast"/>
+        </w:trPr>
+        <w:tc>
+          <w:tcPr>
+            <w:tcW w:type="dxa" w:w="9638"/>
+            <w:tcBorders>
+              <w:top w:val="single" w:color="15203A" w:sz="8"/>
+              <w:left w:val="single" w:color="15203A" w:sz="8"/>
+              <w:bottom w:val="single" w:color="15203A" w:sz="8"/>
+              <w:right w:val="single" w:color="15203A" w:sz="8"/>
+            </w:tcBorders>
+            <w:tcMar>
+              <w:top w:type="dxa" w:w="100"/>
+              <w:left w:type="dxa" w:w="140"/>
+              <w:bottom w:type="dxa" w:w="100"/>
+              <w:right w:type="dxa" w:w="140"/>
+            </w:tcMar>
+          </w:tcPr>
+          <w:p/>
+        </w:tc>
+      </w:tr>
+    </w:tbl>
     <w:sectPr>
       <w:footerReference w:type="default" r:id="rId7"/>
       <w:pgSz w:w="11906" w:h="16838" w:orient="portrait"/>

</xml_diff>